<commit_message>
Add developer notes to final homepage doc
Appends a "Notes for developers" page: component reuse vs new builds,
internal links, metadata/schema, and placeholders to fill.

Co-Authored-By: Claude Opus 4.8 <noreply@anthropic.com>
Claude-Session: https://claude.ai/code/session_01UhVChLeNNjFDr6eASTMGhh
</commit_message>
<xml_diff>
--- a/seo-audit/Trillet-Homepage.docx
+++ b/seo-audit/Trillet-Homepage.docx
@@ -3340,6 +3340,818 @@
           <w:szCs w:val="17"/>
         </w:rPr>
         <w:t xml:space="preserve">A working session with the team that builds the platform, not a scripted demo.</w:t>
+      </w:r>
+    </w:p>
+    <w:p>
+      <w:pPr>
+        <w:pageBreakBefore/>
+        <w:spacing w:after="40"/>
+      </w:pPr>
+      <w:r>
+        <w:rPr>
+          <w:rFonts w:ascii="Consolas" w:cs="Consolas" w:eastAsia="Consolas" w:hAnsi="Consolas"/>
+          <w:b/>
+          <w:bCs/>
+          <w:color w:val="9A6B3F"/>
+          <w:spacing w:val="24"/>
+          <w:sz w:val="16"/>
+          <w:szCs w:val="16"/>
+        </w:rPr>
+        <w:t xml:space="preserve">NOTES FOR DEVELOPERS</w:t>
+      </w:r>
+    </w:p>
+    <w:p>
+      <w:pPr>
+        <w:spacing w:after="60"/>
+      </w:pPr>
+      <w:r>
+        <w:rPr>
+          <w:rFonts w:ascii="Georgia" w:cs="Georgia" w:eastAsia="Georgia" w:hAnsi="Georgia"/>
+          <w:b/>
+          <w:bCs/>
+          <w:color w:val="16223C"/>
+          <w:sz w:val="30"/>
+          <w:szCs w:val="30"/>
+        </w:rPr>
+        <w:t xml:space="preserve">Build instructions</w:t>
+      </w:r>
+    </w:p>
+    <w:p>
+      <w:pPr>
+        <w:spacing w:after="120"/>
+      </w:pPr>
+      <w:r>
+        <w:rPr>
+          <w:rFonts w:ascii="Calibri" w:cs="Calibri" w:eastAsia="Calibri" w:hAnsi="Calibri"/>
+          <w:i/>
+          <w:iCs/>
+          <w:color w:val="5A6675"/>
+          <w:sz w:val="19"/>
+          <w:szCs w:val="19"/>
+        </w:rPr>
+        <w:t xml:space="preserve">Implementation guidance only — not page copy. Most of the page reuses components already on the live site; a few blocks are new.</w:t>
+      </w:r>
+    </w:p>
+    <w:p>
+      <w:pPr>
+        <w:spacing w:after="40" w:before="120"/>
+      </w:pPr>
+      <w:r>
+        <w:rPr>
+          <w:rFonts w:ascii="Consolas" w:cs="Consolas" w:eastAsia="Consolas" w:hAnsi="Consolas"/>
+          <w:b/>
+          <w:bCs/>
+          <w:color w:val="9A6B3F"/>
+          <w:spacing w:val="14"/>
+          <w:sz w:val="15"/>
+          <w:szCs w:val="15"/>
+        </w:rPr>
+        <w:t xml:space="preserve">REUSE — KEEP THESE COMPONENTS AS BUILT</w:t>
+      </w:r>
+    </w:p>
+    <w:p>
+      <w:pPr>
+        <w:pStyle w:val="ListParagraph"/>
+        <w:numPr>
+          <w:ilvl w:val="0"/>
+          <w:numId w:val="1"/>
+        </w:numPr>
+        <w:spacing w:after="50"/>
+      </w:pPr>
+      <w:r>
+        <w:rPr>
+          <w:rFonts w:ascii="Calibri" w:cs="Calibri" w:eastAsia="Calibri" w:hAnsi="Calibri"/>
+          <w:b w:val="false"/>
+          <w:bCs w:val="false"/>
+          <w:color w:val="24303F"/>
+          <w:sz w:val="19"/>
+          <w:szCs w:val="19"/>
+        </w:rPr>
+        <w:t xml:space="preserve">Hero: keep the live-call transcript demo and the “Demo our AI” email capture. Change headline, subhead and eyebrow only.</w:t>
+      </w:r>
+    </w:p>
+    <w:p>
+      <w:pPr>
+        <w:pStyle w:val="ListParagraph"/>
+        <w:numPr>
+          <w:ilvl w:val="0"/>
+          <w:numId w:val="1"/>
+        </w:numPr>
+        <w:spacing w:after="50"/>
+      </w:pPr>
+      <w:r>
+        <w:rPr>
+          <w:rFonts w:ascii="Calibri" w:cs="Calibri" w:eastAsia="Calibri" w:hAnsi="Calibri"/>
+          <w:b w:val="false"/>
+          <w:bCs w:val="false"/>
+          <w:color w:val="24303F"/>
+          <w:sz w:val="19"/>
+          <w:szCs w:val="19"/>
+        </w:rPr>
+        <w:t xml:space="preserve">“How Trillet works”: reuse the existing four-step “From conversation to completed outcome” animation. </w:t>
+      </w:r>
+      <w:r>
+        <w:rPr>
+          <w:rFonts w:ascii="Calibri" w:cs="Calibri" w:eastAsia="Calibri" w:hAnsi="Calibri"/>
+          <w:b/>
+          <w:bCs/>
+          <w:color w:val="24303F"/>
+          <w:sz w:val="19"/>
+          <w:szCs w:val="19"/>
+        </w:rPr>
+        <w:t xml:space="preserve">Rename the fourth step “Closed with full audit” to “Audit trail”, and remove the duplicate render — the block currently outputs twice in the DOM.</w:t>
+      </w:r>
+    </w:p>
+    <w:p>
+      <w:pPr>
+        <w:pStyle w:val="ListParagraph"/>
+        <w:numPr>
+          <w:ilvl w:val="0"/>
+          <w:numId w:val="1"/>
+        </w:numPr>
+        <w:spacing w:after="50"/>
+      </w:pPr>
+      <w:r>
+        <w:rPr>
+          <w:rFonts w:ascii="Calibri" w:cs="Calibri" w:eastAsia="Calibri" w:hAnsi="Calibri"/>
+          <w:b w:val="false"/>
+          <w:bCs w:val="false"/>
+          <w:color w:val="24303F"/>
+          <w:sz w:val="19"/>
+          <w:szCs w:val="19"/>
+        </w:rPr>
+        <w:t xml:space="preserve">Integrations: reuse the “Connected” systems diagram; move it into its own section.</w:t>
+      </w:r>
+    </w:p>
+    <w:p>
+      <w:pPr>
+        <w:pStyle w:val="ListParagraph"/>
+        <w:numPr>
+          <w:ilvl w:val="0"/>
+          <w:numId w:val="1"/>
+        </w:numPr>
+        <w:spacing w:after="50"/>
+      </w:pPr>
+      <w:r>
+        <w:rPr>
+          <w:rFonts w:ascii="Calibri" w:cs="Calibri" w:eastAsia="Calibri" w:hAnsi="Calibri"/>
+          <w:b w:val="false"/>
+          <w:bCs w:val="false"/>
+          <w:color w:val="24303F"/>
+          <w:sz w:val="19"/>
+          <w:szCs w:val="19"/>
+        </w:rPr>
+        <w:t xml:space="preserve">Ship as-is: industry cards, testimonial, security block, certification badge strip, header nav and footer.</w:t>
+      </w:r>
+    </w:p>
+    <w:p>
+      <w:pPr>
+        <w:spacing w:after="40" w:before="120"/>
+      </w:pPr>
+      <w:r>
+        <w:rPr>
+          <w:rFonts w:ascii="Consolas" w:cs="Consolas" w:eastAsia="Consolas" w:hAnsi="Consolas"/>
+          <w:b/>
+          <w:bCs/>
+          <w:color w:val="9A6B3F"/>
+          <w:spacing w:val="14"/>
+          <w:sz w:val="15"/>
+          <w:szCs w:val="15"/>
+        </w:rPr>
+        <w:t xml:space="preserve">BUILD NEW</w:t>
+      </w:r>
+    </w:p>
+    <w:p>
+      <w:pPr>
+        <w:pStyle w:val="ListParagraph"/>
+        <w:numPr>
+          <w:ilvl w:val="0"/>
+          <w:numId w:val="1"/>
+        </w:numPr>
+        <w:spacing w:after="50"/>
+      </w:pPr>
+      <w:r>
+        <w:rPr>
+          <w:rFonts w:ascii="Calibri" w:cs="Calibri" w:eastAsia="Calibri" w:hAnsi="Calibri"/>
+          <w:b w:val="false"/>
+          <w:bCs w:val="false"/>
+          <w:color w:val="24303F"/>
+          <w:sz w:val="19"/>
+          <w:szCs w:val="19"/>
+        </w:rPr>
+        <w:t xml:space="preserve">“One platform / who it’s for” — three ICP cards (small business, agencies, enterprise), each with its own CTA.</w:t>
+      </w:r>
+    </w:p>
+    <w:p>
+      <w:pPr>
+        <w:pStyle w:val="ListParagraph"/>
+        <w:numPr>
+          <w:ilvl w:val="0"/>
+          <w:numId w:val="1"/>
+        </w:numPr>
+        <w:spacing w:after="50"/>
+      </w:pPr>
+      <w:r>
+        <w:rPr>
+          <w:rFonts w:ascii="Calibri" w:cs="Calibri" w:eastAsia="Calibri" w:hAnsi="Calibri"/>
+          <w:b w:val="false"/>
+          <w:bCs w:val="false"/>
+          <w:color w:val="24303F"/>
+          <w:sz w:val="19"/>
+          <w:szCs w:val="19"/>
+        </w:rPr>
+        <w:t xml:space="preserve">“What is a Trillet voice AI agent?” — prose block, placed high.</w:t>
+      </w:r>
+    </w:p>
+    <w:p>
+      <w:pPr>
+        <w:pStyle w:val="ListParagraph"/>
+        <w:numPr>
+          <w:ilvl w:val="0"/>
+          <w:numId w:val="1"/>
+        </w:numPr>
+        <w:spacing w:after="50"/>
+      </w:pPr>
+      <w:r>
+        <w:rPr>
+          <w:rFonts w:ascii="Calibri" w:cs="Calibri" w:eastAsia="Calibri" w:hAnsi="Calibri"/>
+          <w:b w:val="false"/>
+          <w:bCs w:val="false"/>
+          <w:color w:val="24303F"/>
+          <w:sz w:val="19"/>
+          <w:szCs w:val="19"/>
+        </w:rPr>
+        <w:t xml:space="preserve">“Capabilities” — five-card grid (2-up on desktop, 1-up on mobile).</w:t>
+      </w:r>
+    </w:p>
+    <w:p>
+      <w:pPr>
+        <w:pStyle w:val="ListParagraph"/>
+        <w:numPr>
+          <w:ilvl w:val="0"/>
+          <w:numId w:val="1"/>
+        </w:numPr>
+        <w:spacing w:after="50"/>
+      </w:pPr>
+      <w:r>
+        <w:rPr>
+          <w:rFonts w:ascii="Calibri" w:cs="Calibri" w:eastAsia="Calibri" w:hAnsi="Calibri"/>
+          <w:b w:val="false"/>
+          <w:bCs w:val="false"/>
+          <w:color w:val="24303F"/>
+          <w:sz w:val="19"/>
+          <w:szCs w:val="19"/>
+        </w:rPr>
+        <w:t xml:space="preserve">FAQ — accordion. Render answers in the HTML, not on click.</w:t>
+      </w:r>
+    </w:p>
+    <w:p>
+      <w:pPr>
+        <w:spacing w:after="40" w:before="120"/>
+      </w:pPr>
+      <w:r>
+        <w:rPr>
+          <w:rFonts w:ascii="Consolas" w:cs="Consolas" w:eastAsia="Consolas" w:hAnsi="Consolas"/>
+          <w:b/>
+          <w:bCs/>
+          <w:color w:val="9A6B3F"/>
+          <w:spacing w:val="14"/>
+          <w:sz w:val="15"/>
+          <w:szCs w:val="15"/>
+        </w:rPr>
+        <w:t xml:space="preserve">LINKS</w:t>
+      </w:r>
+    </w:p>
+    <w:p>
+      <w:pPr>
+        <w:pStyle w:val="ListParagraph"/>
+        <w:numPr>
+          <w:ilvl w:val="0"/>
+          <w:numId w:val="1"/>
+        </w:numPr>
+        <w:spacing w:after="50"/>
+      </w:pPr>
+      <w:r>
+        <w:rPr>
+          <w:rFonts w:ascii="Calibri" w:cs="Calibri" w:eastAsia="Calibri" w:hAnsi="Calibri"/>
+          <w:b w:val="false"/>
+          <w:bCs w:val="false"/>
+          <w:color w:val="24303F"/>
+          <w:sz w:val="19"/>
+          <w:szCs w:val="19"/>
+        </w:rPr>
+        <w:t xml:space="preserve">ICP card CTAs → </w:t>
+      </w:r>
+      <w:r>
+        <w:rPr>
+          <w:rFonts w:ascii="Consolas" w:cs="Consolas" w:eastAsia="Consolas" w:hAnsi="Consolas"/>
+          <w:color w:val="16223C"/>
+          <w:sz w:val="17"/>
+          <w:szCs w:val="17"/>
+        </w:rPr>
+        <w:t xml:space="preserve">/ai-receptionist</w:t>
+      </w:r>
+      <w:r>
+        <w:rPr>
+          <w:rFonts w:ascii="Calibri" w:cs="Calibri" w:eastAsia="Calibri" w:hAnsi="Calibri"/>
+          <w:b w:val="false"/>
+          <w:bCs w:val="false"/>
+          <w:color w:val="24303F"/>
+          <w:sz w:val="19"/>
+          <w:szCs w:val="19"/>
+        </w:rPr>
+        <w:t xml:space="preserve">, </w:t>
+      </w:r>
+      <w:r>
+        <w:rPr>
+          <w:rFonts w:ascii="Consolas" w:cs="Consolas" w:eastAsia="Consolas" w:hAnsi="Consolas"/>
+          <w:color w:val="16223C"/>
+          <w:sz w:val="17"/>
+          <w:szCs w:val="17"/>
+        </w:rPr>
+        <w:t xml:space="preserve">/whitelabel</w:t>
+      </w:r>
+      <w:r>
+        <w:rPr>
+          <w:rFonts w:ascii="Calibri" w:cs="Calibri" w:eastAsia="Calibri" w:hAnsi="Calibri"/>
+          <w:b w:val="false"/>
+          <w:bCs w:val="false"/>
+          <w:color w:val="24303F"/>
+          <w:sz w:val="19"/>
+          <w:szCs w:val="19"/>
+        </w:rPr>
+        <w:t xml:space="preserve">, </w:t>
+      </w:r>
+      <w:r>
+        <w:rPr>
+          <w:rFonts w:ascii="Consolas" w:cs="Consolas" w:eastAsia="Consolas" w:hAnsi="Consolas"/>
+          <w:color w:val="16223C"/>
+          <w:sz w:val="17"/>
+          <w:szCs w:val="17"/>
+        </w:rPr>
+        <w:t xml:space="preserve">/enterprise</w:t>
+      </w:r>
+      <w:r>
+        <w:rPr>
+          <w:rFonts w:ascii="Calibri" w:cs="Calibri" w:eastAsia="Calibri" w:hAnsi="Calibri"/>
+          <w:b w:val="false"/>
+          <w:bCs w:val="false"/>
+          <w:color w:val="24303F"/>
+          <w:sz w:val="19"/>
+          <w:szCs w:val="19"/>
+        </w:rPr>
+        <w:t xml:space="preserve">.</w:t>
+      </w:r>
+    </w:p>
+    <w:p>
+      <w:pPr>
+        <w:pStyle w:val="ListParagraph"/>
+        <w:numPr>
+          <w:ilvl w:val="0"/>
+          <w:numId w:val="1"/>
+        </w:numPr>
+        <w:spacing w:after="50"/>
+      </w:pPr>
+      <w:r>
+        <w:rPr>
+          <w:rFonts w:ascii="Calibri" w:cs="Calibri" w:eastAsia="Calibri" w:hAnsi="Calibri"/>
+          <w:b w:val="false"/>
+          <w:bCs w:val="false"/>
+          <w:color w:val="24303F"/>
+          <w:sz w:val="19"/>
+          <w:szCs w:val="19"/>
+        </w:rPr>
+        <w:t xml:space="preserve">Industry cards → </w:t>
+      </w:r>
+      <w:r>
+        <w:rPr>
+          <w:rFonts w:ascii="Consolas" w:cs="Consolas" w:eastAsia="Consolas" w:hAnsi="Consolas"/>
+          <w:color w:val="16223C"/>
+          <w:sz w:val="17"/>
+          <w:szCs w:val="17"/>
+        </w:rPr>
+        <w:t xml:space="preserve">/industries/{healthcare,legal,finance,government,utilities}</w:t>
+      </w:r>
+      <w:r>
+        <w:rPr>
+          <w:rFonts w:ascii="Calibri" w:cs="Calibri" w:eastAsia="Calibri" w:hAnsi="Calibri"/>
+          <w:b w:val="false"/>
+          <w:bCs w:val="false"/>
+          <w:color w:val="24303F"/>
+          <w:sz w:val="19"/>
+          <w:szCs w:val="19"/>
+        </w:rPr>
+        <w:t xml:space="preserve">.</w:t>
+      </w:r>
+    </w:p>
+    <w:p>
+      <w:pPr>
+        <w:pStyle w:val="ListParagraph"/>
+        <w:numPr>
+          <w:ilvl w:val="0"/>
+          <w:numId w:val="1"/>
+        </w:numPr>
+        <w:spacing w:after="50"/>
+      </w:pPr>
+      <w:r>
+        <w:rPr>
+          <w:rFonts w:ascii="Calibri" w:cs="Calibri" w:eastAsia="Calibri" w:hAnsi="Calibri"/>
+          <w:b w:val="false"/>
+          <w:bCs w:val="false"/>
+          <w:color w:val="24303F"/>
+          <w:sz w:val="19"/>
+          <w:szCs w:val="19"/>
+        </w:rPr>
+        <w:t xml:space="preserve">Keep competitor comparison links in the footer only, never in the body.</w:t>
+      </w:r>
+    </w:p>
+    <w:p>
+      <w:pPr>
+        <w:spacing w:after="40" w:before="120"/>
+      </w:pPr>
+      <w:r>
+        <w:rPr>
+          <w:rFonts w:ascii="Consolas" w:cs="Consolas" w:eastAsia="Consolas" w:hAnsi="Consolas"/>
+          <w:b/>
+          <w:bCs/>
+          <w:color w:val="9A6B3F"/>
+          <w:spacing w:val="14"/>
+          <w:sz w:val="15"/>
+          <w:szCs w:val="15"/>
+        </w:rPr>
+        <w:t xml:space="preserve">METADATA &amp; SCHEMA</w:t>
+      </w:r>
+    </w:p>
+    <w:p>
+      <w:pPr>
+        <w:pStyle w:val="ListParagraph"/>
+        <w:numPr>
+          <w:ilvl w:val="0"/>
+          <w:numId w:val="1"/>
+        </w:numPr>
+        <w:spacing w:after="50"/>
+      </w:pPr>
+      <w:r>
+        <w:rPr>
+          <w:rFonts w:ascii="Calibri" w:cs="Calibri" w:eastAsia="Calibri" w:hAnsi="Calibri"/>
+          <w:b w:val="false"/>
+          <w:bCs w:val="false"/>
+          <w:color w:val="24303F"/>
+          <w:sz w:val="19"/>
+          <w:szCs w:val="19"/>
+        </w:rPr>
+        <w:t xml:space="preserve">Title: </w:t>
+      </w:r>
+      <w:r>
+        <w:rPr>
+          <w:rFonts w:ascii="Consolas" w:cs="Consolas" w:eastAsia="Consolas" w:hAnsi="Consolas"/>
+          <w:color w:val="16223C"/>
+          <w:sz w:val="17"/>
+          <w:szCs w:val="17"/>
+        </w:rPr>
+        <w:t xml:space="preserve">AI Voice Agents for High-Stakes Calls — Verified &amp; Audited | Trillet</w:t>
+      </w:r>
+    </w:p>
+    <w:p>
+      <w:pPr>
+        <w:pStyle w:val="ListParagraph"/>
+        <w:numPr>
+          <w:ilvl w:val="0"/>
+          <w:numId w:val="1"/>
+        </w:numPr>
+        <w:spacing w:after="50"/>
+      </w:pPr>
+      <w:r>
+        <w:rPr>
+          <w:rFonts w:ascii="Calibri" w:cs="Calibri" w:eastAsia="Calibri" w:hAnsi="Calibri"/>
+          <w:b w:val="false"/>
+          <w:bCs w:val="false"/>
+          <w:color w:val="24303F"/>
+          <w:sz w:val="19"/>
+          <w:szCs w:val="19"/>
+        </w:rPr>
+        <w:t xml:space="preserve">Add JSON-LD: </w:t>
+      </w:r>
+      <w:r>
+        <w:rPr>
+          <w:rFonts w:ascii="Consolas" w:cs="Consolas" w:eastAsia="Consolas" w:hAnsi="Consolas"/>
+          <w:color w:val="16223C"/>
+          <w:sz w:val="17"/>
+          <w:szCs w:val="17"/>
+        </w:rPr>
+        <w:t xml:space="preserve">SoftwareApplication</w:t>
+      </w:r>
+      <w:r>
+        <w:rPr>
+          <w:rFonts w:ascii="Calibri" w:cs="Calibri" w:eastAsia="Calibri" w:hAnsi="Calibri"/>
+          <w:b w:val="false"/>
+          <w:bCs w:val="false"/>
+          <w:color w:val="24303F"/>
+          <w:sz w:val="19"/>
+          <w:szCs w:val="19"/>
+        </w:rPr>
+        <w:t xml:space="preserve"> + </w:t>
+      </w:r>
+      <w:r>
+        <w:rPr>
+          <w:rFonts w:ascii="Consolas" w:cs="Consolas" w:eastAsia="Consolas" w:hAnsi="Consolas"/>
+          <w:color w:val="16223C"/>
+          <w:sz w:val="17"/>
+          <w:szCs w:val="17"/>
+        </w:rPr>
+        <w:t xml:space="preserve">Offer</w:t>
+      </w:r>
+      <w:r>
+        <w:rPr>
+          <w:rFonts w:ascii="Calibri" w:cs="Calibri" w:eastAsia="Calibri" w:hAnsi="Calibri"/>
+          <w:b w:val="false"/>
+          <w:bCs w:val="false"/>
+          <w:color w:val="24303F"/>
+          <w:sz w:val="19"/>
+          <w:szCs w:val="19"/>
+        </w:rPr>
+        <w:t xml:space="preserve"> (from $49/mo) + </w:t>
+      </w:r>
+      <w:r>
+        <w:rPr>
+          <w:rFonts w:ascii="Consolas" w:cs="Consolas" w:eastAsia="Consolas" w:hAnsi="Consolas"/>
+          <w:color w:val="16223C"/>
+          <w:sz w:val="17"/>
+          <w:szCs w:val="17"/>
+        </w:rPr>
+        <w:t xml:space="preserve">AggregateRating</w:t>
+      </w:r>
+      <w:r>
+        <w:rPr>
+          <w:rFonts w:ascii="Calibri" w:cs="Calibri" w:eastAsia="Calibri" w:hAnsi="Calibri"/>
+          <w:b w:val="false"/>
+          <w:bCs w:val="false"/>
+          <w:color w:val="24303F"/>
+          <w:sz w:val="19"/>
+          <w:szCs w:val="19"/>
+        </w:rPr>
+        <w:t xml:space="preserve"> (Trustpilot 4.6) + </w:t>
+      </w:r>
+      <w:r>
+        <w:rPr>
+          <w:rFonts w:ascii="Consolas" w:cs="Consolas" w:eastAsia="Consolas" w:hAnsi="Consolas"/>
+          <w:color w:val="16223C"/>
+          <w:sz w:val="17"/>
+          <w:szCs w:val="17"/>
+        </w:rPr>
+        <w:t xml:space="preserve">FAQPage</w:t>
+      </w:r>
+      <w:r>
+        <w:rPr>
+          <w:rFonts w:ascii="Calibri" w:cs="Calibri" w:eastAsia="Calibri" w:hAnsi="Calibri"/>
+          <w:b w:val="false"/>
+          <w:bCs w:val="false"/>
+          <w:color w:val="24303F"/>
+          <w:sz w:val="19"/>
+          <w:szCs w:val="19"/>
+        </w:rPr>
+        <w:t xml:space="preserve"> (mirror the FAQ) + </w:t>
+      </w:r>
+      <w:r>
+        <w:rPr>
+          <w:rFonts w:ascii="Consolas" w:cs="Consolas" w:eastAsia="Consolas" w:hAnsi="Consolas"/>
+          <w:color w:val="16223C"/>
+          <w:sz w:val="17"/>
+          <w:szCs w:val="17"/>
+        </w:rPr>
+        <w:t xml:space="preserve">SearchAction</w:t>
+      </w:r>
+      <w:r>
+        <w:rPr>
+          <w:rFonts w:ascii="Calibri" w:cs="Calibri" w:eastAsia="Calibri" w:hAnsi="Calibri"/>
+          <w:b w:val="false"/>
+          <w:bCs w:val="false"/>
+          <w:color w:val="24303F"/>
+          <w:sz w:val="19"/>
+          <w:szCs w:val="19"/>
+        </w:rPr>
+        <w:t xml:space="preserve"> on </w:t>
+      </w:r>
+      <w:r>
+        <w:rPr>
+          <w:rFonts w:ascii="Consolas" w:cs="Consolas" w:eastAsia="Consolas" w:hAnsi="Consolas"/>
+          <w:color w:val="16223C"/>
+          <w:sz w:val="17"/>
+          <w:szCs w:val="17"/>
+        </w:rPr>
+        <w:t xml:space="preserve">WebSite</w:t>
+      </w:r>
+      <w:r>
+        <w:rPr>
+          <w:rFonts w:ascii="Calibri" w:cs="Calibri" w:eastAsia="Calibri" w:hAnsi="Calibri"/>
+          <w:b w:val="false"/>
+          <w:bCs w:val="false"/>
+          <w:color w:val="24303F"/>
+          <w:sz w:val="19"/>
+          <w:szCs w:val="19"/>
+        </w:rPr>
+        <w:t xml:space="preserve">.</w:t>
+      </w:r>
+    </w:p>
+    <w:p>
+      <w:pPr>
+        <w:pStyle w:val="ListParagraph"/>
+        <w:numPr>
+          <w:ilvl w:val="0"/>
+          <w:numId w:val="1"/>
+        </w:numPr>
+        <w:spacing w:after="50"/>
+      </w:pPr>
+      <w:r>
+        <w:rPr>
+          <w:rFonts w:ascii="Calibri" w:cs="Calibri" w:eastAsia="Calibri" w:hAnsi="Calibri"/>
+          <w:b w:val="false"/>
+          <w:bCs w:val="false"/>
+          <w:color w:val="24303F"/>
+          <w:sz w:val="19"/>
+          <w:szCs w:val="19"/>
+        </w:rPr>
+        <w:t xml:space="preserve">Remove the site-wide </w:t>
+      </w:r>
+      <w:r>
+        <w:rPr>
+          <w:rFonts w:ascii="Consolas" w:cs="Consolas" w:eastAsia="Consolas" w:hAnsi="Consolas"/>
+          <w:color w:val="16223C"/>
+          <w:sz w:val="17"/>
+          <w:szCs w:val="17"/>
+        </w:rPr>
+        <w:t xml:space="preserve">meta keywords</w:t>
+      </w:r>
+      <w:r>
+        <w:rPr>
+          <w:rFonts w:ascii="Calibri" w:cs="Calibri" w:eastAsia="Calibri" w:hAnsi="Calibri"/>
+          <w:b w:val="false"/>
+          <w:bCs w:val="false"/>
+          <w:color w:val="24303F"/>
+          <w:sz w:val="19"/>
+          <w:szCs w:val="19"/>
+        </w:rPr>
+        <w:t xml:space="preserve"> block (currently Australia answering-service terms).</w:t>
+      </w:r>
+    </w:p>
+    <w:p>
+      <w:pPr>
+        <w:pStyle w:val="ListParagraph"/>
+        <w:numPr>
+          <w:ilvl w:val="0"/>
+          <w:numId w:val="1"/>
+        </w:numPr>
+        <w:spacing w:after="50"/>
+      </w:pPr>
+      <w:r>
+        <w:rPr>
+          <w:rFonts w:ascii="Calibri" w:cs="Calibri" w:eastAsia="Calibri" w:hAnsi="Calibri"/>
+          <w:b w:val="false"/>
+          <w:bCs w:val="false"/>
+          <w:color w:val="24303F"/>
+          <w:sz w:val="19"/>
+          <w:szCs w:val="19"/>
+        </w:rPr>
+        <w:t xml:space="preserve">One </w:t>
+      </w:r>
+      <w:r>
+        <w:rPr>
+          <w:rFonts w:ascii="Consolas" w:cs="Consolas" w:eastAsia="Consolas" w:hAnsi="Consolas"/>
+          <w:color w:val="16223C"/>
+          <w:sz w:val="17"/>
+          <w:szCs w:val="17"/>
+        </w:rPr>
+        <w:t xml:space="preserve">&lt;h1&gt;</w:t>
+      </w:r>
+      <w:r>
+        <w:rPr>
+          <w:rFonts w:ascii="Calibri" w:cs="Calibri" w:eastAsia="Calibri" w:hAnsi="Calibri"/>
+          <w:b w:val="false"/>
+          <w:bCs w:val="false"/>
+          <w:color w:val="24303F"/>
+          <w:sz w:val="19"/>
+          <w:szCs w:val="19"/>
+        </w:rPr>
+        <w:t xml:space="preserve"> (the hero). Section titles as </w:t>
+      </w:r>
+      <w:r>
+        <w:rPr>
+          <w:rFonts w:ascii="Consolas" w:cs="Consolas" w:eastAsia="Consolas" w:hAnsi="Consolas"/>
+          <w:color w:val="16223C"/>
+          <w:sz w:val="17"/>
+          <w:szCs w:val="17"/>
+        </w:rPr>
+        <w:t xml:space="preserve">&lt;h2&gt;</w:t>
+      </w:r>
+      <w:r>
+        <w:rPr>
+          <w:rFonts w:ascii="Calibri" w:cs="Calibri" w:eastAsia="Calibri" w:hAnsi="Calibri"/>
+          <w:b w:val="false"/>
+          <w:bCs w:val="false"/>
+          <w:color w:val="24303F"/>
+          <w:sz w:val="19"/>
+          <w:szCs w:val="19"/>
+        </w:rPr>
+        <w:t xml:space="preserve">, FAQ questions as </w:t>
+      </w:r>
+      <w:r>
+        <w:rPr>
+          <w:rFonts w:ascii="Consolas" w:cs="Consolas" w:eastAsia="Consolas" w:hAnsi="Consolas"/>
+          <w:color w:val="16223C"/>
+          <w:sz w:val="17"/>
+          <w:szCs w:val="17"/>
+        </w:rPr>
+        <w:t xml:space="preserve">&lt;h3&gt;</w:t>
+      </w:r>
+      <w:r>
+        <w:rPr>
+          <w:rFonts w:ascii="Calibri" w:cs="Calibri" w:eastAsia="Calibri" w:hAnsi="Calibri"/>
+          <w:b w:val="false"/>
+          <w:bCs w:val="false"/>
+          <w:color w:val="24303F"/>
+          <w:sz w:val="19"/>
+          <w:szCs w:val="19"/>
+        </w:rPr>
+        <w:t xml:space="preserve">. Add descriptive </w:t>
+      </w:r>
+      <w:r>
+        <w:rPr>
+          <w:rFonts w:ascii="Consolas" w:cs="Consolas" w:eastAsia="Consolas" w:hAnsi="Consolas"/>
+          <w:color w:val="16223C"/>
+          <w:sz w:val="17"/>
+          <w:szCs w:val="17"/>
+        </w:rPr>
+        <w:t xml:space="preserve">alt</w:t>
+      </w:r>
+      <w:r>
+        <w:rPr>
+          <w:rFonts w:ascii="Calibri" w:cs="Calibri" w:eastAsia="Calibri" w:hAnsi="Calibri"/>
+          <w:b w:val="false"/>
+          <w:bCs w:val="false"/>
+          <w:color w:val="24303F"/>
+          <w:sz w:val="19"/>
+          <w:szCs w:val="19"/>
+        </w:rPr>
+        <w:t xml:space="preserve"> text to hero and feature images.</w:t>
+      </w:r>
+    </w:p>
+    <w:p>
+      <w:pPr>
+        <w:spacing w:after="40" w:before="120"/>
+      </w:pPr>
+      <w:r>
+        <w:rPr>
+          <w:rFonts w:ascii="Consolas" w:cs="Consolas" w:eastAsia="Consolas" w:hAnsi="Consolas"/>
+          <w:b/>
+          <w:bCs/>
+          <w:color w:val="9A6B3F"/>
+          <w:spacing w:val="14"/>
+          <w:sz w:val="15"/>
+          <w:szCs w:val="15"/>
+        </w:rPr>
+        <w:t xml:space="preserve">PLACEHOLDERS TO FILL BEFORE LAUNCH</w:t>
+      </w:r>
+    </w:p>
+    <w:p>
+      <w:pPr>
+        <w:pStyle w:val="ListParagraph"/>
+        <w:numPr>
+          <w:ilvl w:val="0"/>
+          <w:numId w:val="1"/>
+        </w:numPr>
+        <w:spacing w:after="50"/>
+      </w:pPr>
+      <w:r>
+        <w:rPr>
+          <w:rFonts w:ascii="Calibri" w:cs="Calibri" w:eastAsia="Calibri" w:hAnsi="Calibri"/>
+          <w:b w:val="false"/>
+          <w:bCs w:val="false"/>
+          <w:color w:val="24303F"/>
+          <w:sz w:val="19"/>
+          <w:szCs w:val="19"/>
+        </w:rPr>
+        <w:t xml:space="preserve">Real integration names and logos (Integrations section).</w:t>
+      </w:r>
+    </w:p>
+    <w:p>
+      <w:pPr>
+        <w:pStyle w:val="ListParagraph"/>
+        <w:numPr>
+          <w:ilvl w:val="0"/>
+          <w:numId w:val="1"/>
+        </w:numPr>
+        <w:spacing w:after="50"/>
+      </w:pPr>
+      <w:r>
+        <w:rPr>
+          <w:rFonts w:ascii="Calibri" w:cs="Calibri" w:eastAsia="Calibri" w:hAnsi="Calibri"/>
+          <w:b w:val="false"/>
+          <w:bCs w:val="false"/>
+          <w:color w:val="24303F"/>
+          <w:sz w:val="19"/>
+          <w:szCs w:val="19"/>
+        </w:rPr>
+        <w:t xml:space="preserve">Real customer logos (brand strip).</w:t>
       </w:r>
     </w:p>
     <w:sectPr>

</xml_diff>

<commit_message>
Embed structured-data (schema) section in homepage doc
Adds the JSON-LD blocks (Organization/WebSite/SoftwareApplication graph +
FAQPage) inline after the developer notes, sourced from the raw schema
file so both stay in sync.

Co-Authored-By: Claude Opus 4.8 <noreply@anthropic.com>
Claude-Session: https://claude.ai/code/session_01UhVChLeNNjFDr6eASTMGhh
</commit_message>
<xml_diff>
--- a/seo-audit/Trillet-Homepage.docx
+++ b/seo-audit/Trillet-Homepage.docx
@@ -4152,6 +4152,1403 @@
           <w:szCs w:val="19"/>
         </w:rPr>
         <w:t xml:space="preserve">Real customer logos (brand strip).</w:t>
+      </w:r>
+    </w:p>
+    <w:p>
+      <w:pPr>
+        <w:pageBreakBefore/>
+        <w:spacing w:after="40"/>
+      </w:pPr>
+      <w:r>
+        <w:rPr>
+          <w:rFonts w:ascii="Consolas" w:cs="Consolas" w:eastAsia="Consolas" w:hAnsi="Consolas"/>
+          <w:b/>
+          <w:bCs/>
+          <w:color w:val="9A6B3F"/>
+          <w:spacing w:val="24"/>
+          <w:sz w:val="16"/>
+          <w:szCs w:val="16"/>
+        </w:rPr>
+        <w:t xml:space="preserve">STRUCTURED DATA (SCHEMA)</w:t>
+      </w:r>
+    </w:p>
+    <w:p>
+      <w:pPr>
+        <w:spacing w:after="60"/>
+      </w:pPr>
+      <w:r>
+        <w:rPr>
+          <w:rFonts w:ascii="Georgia" w:cs="Georgia" w:eastAsia="Georgia" w:hAnsi="Georgia"/>
+          <w:b/>
+          <w:bCs/>
+          <w:color w:val="16223C"/>
+          <w:sz w:val="30"/>
+          <w:szCs w:val="30"/>
+        </w:rPr>
+        <w:t xml:space="preserve">JSON-LD to add</w:t>
+      </w:r>
+    </w:p>
+    <w:p>
+      <w:pPr>
+        <w:spacing w:after="120"/>
+      </w:pPr>
+      <w:r>
+        <w:rPr>
+          <w:rFonts w:ascii="Calibri" w:cs="Calibri" w:eastAsia="Calibri" w:hAnsi="Calibri"/>
+          <w:i/>
+          <w:iCs/>
+          <w:color w:val="5A6675"/>
+          <w:sz w:val="19"/>
+          <w:szCs w:val="19"/>
+        </w:rPr>
+        <w:t xml:space="preserve">Add both blocks in the page &lt;head&gt;. Replace every REPLACE_ value before shipping, and use straight quotes only when copying. Placement, field-by-field notes and caveats are in the companion schema doc.</w:t>
+      </w:r>
+    </w:p>
+    <w:p>
+      <w:pPr>
+        <w:spacing w:after="40" w:before="120"/>
+      </w:pPr>
+      <w:r>
+        <w:rPr>
+          <w:rFonts w:ascii="Consolas" w:cs="Consolas" w:eastAsia="Consolas" w:hAnsi="Consolas"/>
+          <w:b/>
+          <w:bCs/>
+          <w:color w:val="9A6B3F"/>
+          <w:spacing w:val="14"/>
+          <w:sz w:val="15"/>
+          <w:szCs w:val="15"/>
+        </w:rPr>
+        <w:t xml:space="preserve">BLOCK 1 — ORGANIZATION + WEBSITE + SOFTWAREAPPLICATION (@GRAPH)</w:t>
+      </w:r>
+    </w:p>
+    <w:tbl>
+      <w:tblPr>
+        <w:tblW w:type="dxa" w:w="9360"/>
+        <w:tblBorders>
+          <w:top w:val="single" w:color="D9DEE8" w:sz="4"/>
+          <w:left w:val="single" w:color="D9DEE8" w:sz="4"/>
+          <w:bottom w:val="single" w:color="D9DEE8" w:sz="4"/>
+          <w:right w:val="single" w:color="D9DEE8" w:sz="4"/>
+          <w:insideH w:val="single" w:color="D9DEE8" w:sz="4"/>
+          <w:insideV w:val="single" w:color="D9DEE8" w:sz="4"/>
+        </w:tblBorders>
+      </w:tblPr>
+      <w:tblGrid>
+        <w:gridCol w:w="9360"/>
+      </w:tblGrid>
+      <w:tr>
+        <w:tc>
+          <w:tcPr>
+            <w:tcW w:type="dxa" w:w="9360"/>
+            <w:shd w:fill="F3F5F8" w:color="auto" w:val="clear"/>
+            <w:tcMar>
+              <w:top w:type="dxa" w:w="120"/>
+              <w:left w:type="dxa" w:w="150"/>
+              <w:bottom w:type="dxa" w:w="120"/>
+              <w:right w:type="dxa" w:w="150"/>
+            </w:tcMar>
+          </w:tcPr>
+          <w:p>
+            <w:pPr>
+              <w:spacing w:after="0" w:line="240"/>
+            </w:pPr>
+            <w:r>
+              <w:rPr>
+                <w:rFonts w:ascii="Consolas" w:cs="Consolas" w:eastAsia="Consolas" w:hAnsi="Consolas"/>
+                <w:color w:val="24303F"/>
+                <w:sz w:val="15"/>
+                <w:szCs w:val="15"/>
+              </w:rPr>
+              <w:t xml:space="preserve">&lt;script type="application/ld+json"&gt;</w:t>
+            </w:r>
+          </w:p>
+          <w:p>
+            <w:pPr>
+              <w:spacing w:after="0" w:line="240"/>
+            </w:pPr>
+            <w:r>
+              <w:rPr>
+                <w:rFonts w:ascii="Consolas" w:cs="Consolas" w:eastAsia="Consolas" w:hAnsi="Consolas"/>
+                <w:color w:val="24303F"/>
+                <w:sz w:val="15"/>
+                <w:szCs w:val="15"/>
+              </w:rPr>
+              <w:t xml:space="preserve">{</w:t>
+            </w:r>
+          </w:p>
+          <w:p>
+            <w:pPr>
+              <w:spacing w:after="0" w:line="240"/>
+            </w:pPr>
+            <w:r>
+              <w:rPr>
+                <w:rFonts w:ascii="Consolas" w:cs="Consolas" w:eastAsia="Consolas" w:hAnsi="Consolas"/>
+                <w:color w:val="24303F"/>
+                <w:sz w:val="15"/>
+                <w:szCs w:val="15"/>
+              </w:rPr>
+              <w:t xml:space="preserve">  "@context": "https://schema.org",</w:t>
+            </w:r>
+          </w:p>
+          <w:p>
+            <w:pPr>
+              <w:spacing w:after="0" w:line="240"/>
+            </w:pPr>
+            <w:r>
+              <w:rPr>
+                <w:rFonts w:ascii="Consolas" w:cs="Consolas" w:eastAsia="Consolas" w:hAnsi="Consolas"/>
+                <w:color w:val="24303F"/>
+                <w:sz w:val="15"/>
+                <w:szCs w:val="15"/>
+              </w:rPr>
+              <w:t xml:space="preserve">  "@graph": [</w:t>
+            </w:r>
+          </w:p>
+          <w:p>
+            <w:pPr>
+              <w:spacing w:after="0" w:line="240"/>
+            </w:pPr>
+            <w:r>
+              <w:rPr>
+                <w:rFonts w:ascii="Consolas" w:cs="Consolas" w:eastAsia="Consolas" w:hAnsi="Consolas"/>
+                <w:color w:val="24303F"/>
+                <w:sz w:val="15"/>
+                <w:szCs w:val="15"/>
+              </w:rPr>
+              <w:t xml:space="preserve">    {</w:t>
+            </w:r>
+          </w:p>
+          <w:p>
+            <w:pPr>
+              <w:spacing w:after="0" w:line="240"/>
+            </w:pPr>
+            <w:r>
+              <w:rPr>
+                <w:rFonts w:ascii="Consolas" w:cs="Consolas" w:eastAsia="Consolas" w:hAnsi="Consolas"/>
+                <w:color w:val="24303F"/>
+                <w:sz w:val="15"/>
+                <w:szCs w:val="15"/>
+              </w:rPr>
+              <w:t xml:space="preserve">      "@type": "Organization",</w:t>
+            </w:r>
+          </w:p>
+          <w:p>
+            <w:pPr>
+              <w:spacing w:after="0" w:line="240"/>
+            </w:pPr>
+            <w:r>
+              <w:rPr>
+                <w:rFonts w:ascii="Consolas" w:cs="Consolas" w:eastAsia="Consolas" w:hAnsi="Consolas"/>
+                <w:color w:val="24303F"/>
+                <w:sz w:val="15"/>
+                <w:szCs w:val="15"/>
+              </w:rPr>
+              <w:t xml:space="preserve">      "@id": "https://trillet.ai/#organization",</w:t>
+            </w:r>
+          </w:p>
+          <w:p>
+            <w:pPr>
+              <w:spacing w:after="0" w:line="240"/>
+            </w:pPr>
+            <w:r>
+              <w:rPr>
+                <w:rFonts w:ascii="Consolas" w:cs="Consolas" w:eastAsia="Consolas" w:hAnsi="Consolas"/>
+                <w:color w:val="24303F"/>
+                <w:sz w:val="15"/>
+                <w:szCs w:val="15"/>
+              </w:rPr>
+              <w:t xml:space="preserve">      "name": "Trillet",</w:t>
+            </w:r>
+          </w:p>
+          <w:p>
+            <w:pPr>
+              <w:spacing w:after="0" w:line="240"/>
+            </w:pPr>
+            <w:r>
+              <w:rPr>
+                <w:rFonts w:ascii="Consolas" w:cs="Consolas" w:eastAsia="Consolas" w:hAnsi="Consolas"/>
+                <w:color w:val="24303F"/>
+                <w:sz w:val="15"/>
+                <w:szCs w:val="15"/>
+              </w:rPr>
+              <w:t xml:space="preserve">      "url": "https://trillet.ai/",</w:t>
+            </w:r>
+          </w:p>
+          <w:p>
+            <w:pPr>
+              <w:spacing w:after="0" w:line="240"/>
+            </w:pPr>
+            <w:r>
+              <w:rPr>
+                <w:rFonts w:ascii="Consolas" w:cs="Consolas" w:eastAsia="Consolas" w:hAnsi="Consolas"/>
+                <w:color w:val="24303F"/>
+                <w:sz w:val="15"/>
+                <w:szCs w:val="15"/>
+              </w:rPr>
+              <w:t xml:space="preserve">      "logo": "https://trillet.ai/REPLACE-logo.png",</w:t>
+            </w:r>
+          </w:p>
+          <w:p>
+            <w:pPr>
+              <w:spacing w:after="0" w:line="240"/>
+            </w:pPr>
+            <w:r>
+              <w:rPr>
+                <w:rFonts w:ascii="Consolas" w:cs="Consolas" w:eastAsia="Consolas" w:hAnsi="Consolas"/>
+                <w:color w:val="24303F"/>
+                <w:sz w:val="15"/>
+                <w:szCs w:val="15"/>
+              </w:rPr>
+              <w:t xml:space="preserve">      "sameAs": [</w:t>
+            </w:r>
+          </w:p>
+          <w:p>
+            <w:pPr>
+              <w:spacing w:after="0" w:line="240"/>
+            </w:pPr>
+            <w:r>
+              <w:rPr>
+                <w:rFonts w:ascii="Consolas" w:cs="Consolas" w:eastAsia="Consolas" w:hAnsi="Consolas"/>
+                <w:color w:val="24303F"/>
+                <w:sz w:val="15"/>
+                <w:szCs w:val="15"/>
+              </w:rPr>
+              <w:t xml:space="preserve">        "https://www.linkedin.com/company/REPLACE",</w:t>
+            </w:r>
+          </w:p>
+          <w:p>
+            <w:pPr>
+              <w:spacing w:after="0" w:line="240"/>
+            </w:pPr>
+            <w:r>
+              <w:rPr>
+                <w:rFonts w:ascii="Consolas" w:cs="Consolas" w:eastAsia="Consolas" w:hAnsi="Consolas"/>
+                <w:color w:val="24303F"/>
+                <w:sz w:val="15"/>
+                <w:szCs w:val="15"/>
+              </w:rPr>
+              <w:t xml:space="preserve">        "https://www.youtube.com/@REPLACE"</w:t>
+            </w:r>
+          </w:p>
+          <w:p>
+            <w:pPr>
+              <w:spacing w:after="0" w:line="240"/>
+            </w:pPr>
+            <w:r>
+              <w:rPr>
+                <w:rFonts w:ascii="Consolas" w:cs="Consolas" w:eastAsia="Consolas" w:hAnsi="Consolas"/>
+                <w:color w:val="24303F"/>
+                <w:sz w:val="15"/>
+                <w:szCs w:val="15"/>
+              </w:rPr>
+              <w:t xml:space="preserve">      ],</w:t>
+            </w:r>
+          </w:p>
+          <w:p>
+            <w:pPr>
+              <w:spacing w:after="0" w:line="240"/>
+            </w:pPr>
+            <w:r>
+              <w:rPr>
+                <w:rFonts w:ascii="Consolas" w:cs="Consolas" w:eastAsia="Consolas" w:hAnsi="Consolas"/>
+                <w:color w:val="24303F"/>
+                <w:sz w:val="15"/>
+                <w:szCs w:val="15"/>
+              </w:rPr>
+              <w:t xml:space="preserve">      "contactPoint": {</w:t>
+            </w:r>
+          </w:p>
+          <w:p>
+            <w:pPr>
+              <w:spacing w:after="0" w:line="240"/>
+            </w:pPr>
+            <w:r>
+              <w:rPr>
+                <w:rFonts w:ascii="Consolas" w:cs="Consolas" w:eastAsia="Consolas" w:hAnsi="Consolas"/>
+                <w:color w:val="24303F"/>
+                <w:sz w:val="15"/>
+                <w:szCs w:val="15"/>
+              </w:rPr>
+              <w:t xml:space="preserve">        "@type": "ContactPoint",</w:t>
+            </w:r>
+          </w:p>
+          <w:p>
+            <w:pPr>
+              <w:spacing w:after="0" w:line="240"/>
+            </w:pPr>
+            <w:r>
+              <w:rPr>
+                <w:rFonts w:ascii="Consolas" w:cs="Consolas" w:eastAsia="Consolas" w:hAnsi="Consolas"/>
+                <w:color w:val="24303F"/>
+                <w:sz w:val="15"/>
+                <w:szCs w:val="15"/>
+              </w:rPr>
+              <w:t xml:space="preserve">        "contactType": "sales",</w:t>
+            </w:r>
+          </w:p>
+          <w:p>
+            <w:pPr>
+              <w:spacing w:after="0" w:line="240"/>
+            </w:pPr>
+            <w:r>
+              <w:rPr>
+                <w:rFonts w:ascii="Consolas" w:cs="Consolas" w:eastAsia="Consolas" w:hAnsi="Consolas"/>
+                <w:color w:val="24303F"/>
+                <w:sz w:val="15"/>
+                <w:szCs w:val="15"/>
+              </w:rPr>
+              <w:t xml:space="preserve">        "url": "https://trillet.ai/contact"</w:t>
+            </w:r>
+          </w:p>
+          <w:p>
+            <w:pPr>
+              <w:spacing w:after="0" w:line="240"/>
+            </w:pPr>
+            <w:r>
+              <w:rPr>
+                <w:rFonts w:ascii="Consolas" w:cs="Consolas" w:eastAsia="Consolas" w:hAnsi="Consolas"/>
+                <w:color w:val="24303F"/>
+                <w:sz w:val="15"/>
+                <w:szCs w:val="15"/>
+              </w:rPr>
+              <w:t xml:space="preserve">      }</w:t>
+            </w:r>
+          </w:p>
+          <w:p>
+            <w:pPr>
+              <w:spacing w:after="0" w:line="240"/>
+            </w:pPr>
+            <w:r>
+              <w:rPr>
+                <w:rFonts w:ascii="Consolas" w:cs="Consolas" w:eastAsia="Consolas" w:hAnsi="Consolas"/>
+                <w:color w:val="24303F"/>
+                <w:sz w:val="15"/>
+                <w:szCs w:val="15"/>
+              </w:rPr>
+              <w:t xml:space="preserve">    },</w:t>
+            </w:r>
+          </w:p>
+          <w:p>
+            <w:pPr>
+              <w:spacing w:after="0" w:line="240"/>
+            </w:pPr>
+            <w:r>
+              <w:rPr>
+                <w:rFonts w:ascii="Consolas" w:cs="Consolas" w:eastAsia="Consolas" w:hAnsi="Consolas"/>
+                <w:color w:val="24303F"/>
+                <w:sz w:val="15"/>
+                <w:szCs w:val="15"/>
+              </w:rPr>
+              <w:t xml:space="preserve">    {</w:t>
+            </w:r>
+          </w:p>
+          <w:p>
+            <w:pPr>
+              <w:spacing w:after="0" w:line="240"/>
+            </w:pPr>
+            <w:r>
+              <w:rPr>
+                <w:rFonts w:ascii="Consolas" w:cs="Consolas" w:eastAsia="Consolas" w:hAnsi="Consolas"/>
+                <w:color w:val="24303F"/>
+                <w:sz w:val="15"/>
+                <w:szCs w:val="15"/>
+              </w:rPr>
+              <w:t xml:space="preserve">      "@type": "WebSite",</w:t>
+            </w:r>
+          </w:p>
+          <w:p>
+            <w:pPr>
+              <w:spacing w:after="0" w:line="240"/>
+            </w:pPr>
+            <w:r>
+              <w:rPr>
+                <w:rFonts w:ascii="Consolas" w:cs="Consolas" w:eastAsia="Consolas" w:hAnsi="Consolas"/>
+                <w:color w:val="24303F"/>
+                <w:sz w:val="15"/>
+                <w:szCs w:val="15"/>
+              </w:rPr>
+              <w:t xml:space="preserve">      "@id": "https://trillet.ai/#website",</w:t>
+            </w:r>
+          </w:p>
+          <w:p>
+            <w:pPr>
+              <w:spacing w:after="0" w:line="240"/>
+            </w:pPr>
+            <w:r>
+              <w:rPr>
+                <w:rFonts w:ascii="Consolas" w:cs="Consolas" w:eastAsia="Consolas" w:hAnsi="Consolas"/>
+                <w:color w:val="24303F"/>
+                <w:sz w:val="15"/>
+                <w:szCs w:val="15"/>
+              </w:rPr>
+              <w:t xml:space="preserve">      "url": "https://trillet.ai/",</w:t>
+            </w:r>
+          </w:p>
+          <w:p>
+            <w:pPr>
+              <w:spacing w:after="0" w:line="240"/>
+            </w:pPr>
+            <w:r>
+              <w:rPr>
+                <w:rFonts w:ascii="Consolas" w:cs="Consolas" w:eastAsia="Consolas" w:hAnsi="Consolas"/>
+                <w:color w:val="24303F"/>
+                <w:sz w:val="15"/>
+                <w:szCs w:val="15"/>
+              </w:rPr>
+              <w:t xml:space="preserve">      "name": "Trillet",</w:t>
+            </w:r>
+          </w:p>
+          <w:p>
+            <w:pPr>
+              <w:spacing w:after="0" w:line="240"/>
+            </w:pPr>
+            <w:r>
+              <w:rPr>
+                <w:rFonts w:ascii="Consolas" w:cs="Consolas" w:eastAsia="Consolas" w:hAnsi="Consolas"/>
+                <w:color w:val="24303F"/>
+                <w:sz w:val="15"/>
+                <w:szCs w:val="15"/>
+              </w:rPr>
+              <w:t xml:space="preserve">      "publisher": { "@id": "https://trillet.ai/#organization" },</w:t>
+            </w:r>
+          </w:p>
+          <w:p>
+            <w:pPr>
+              <w:spacing w:after="0" w:line="240"/>
+            </w:pPr>
+            <w:r>
+              <w:rPr>
+                <w:rFonts w:ascii="Consolas" w:cs="Consolas" w:eastAsia="Consolas" w:hAnsi="Consolas"/>
+                <w:color w:val="24303F"/>
+                <w:sz w:val="15"/>
+                <w:szCs w:val="15"/>
+              </w:rPr>
+              <w:t xml:space="preserve">      "potentialAction": {</w:t>
+            </w:r>
+          </w:p>
+          <w:p>
+            <w:pPr>
+              <w:spacing w:after="0" w:line="240"/>
+            </w:pPr>
+            <w:r>
+              <w:rPr>
+                <w:rFonts w:ascii="Consolas" w:cs="Consolas" w:eastAsia="Consolas" w:hAnsi="Consolas"/>
+                <w:color w:val="24303F"/>
+                <w:sz w:val="15"/>
+                <w:szCs w:val="15"/>
+              </w:rPr>
+              <w:t xml:space="preserve">        "@type": "SearchAction",</w:t>
+            </w:r>
+          </w:p>
+          <w:p>
+            <w:pPr>
+              <w:spacing w:after="0" w:line="240"/>
+            </w:pPr>
+            <w:r>
+              <w:rPr>
+                <w:rFonts w:ascii="Consolas" w:cs="Consolas" w:eastAsia="Consolas" w:hAnsi="Consolas"/>
+                <w:color w:val="24303F"/>
+                <w:sz w:val="15"/>
+                <w:szCs w:val="15"/>
+              </w:rPr>
+              <w:t xml:space="preserve">        "target": {</w:t>
+            </w:r>
+          </w:p>
+          <w:p>
+            <w:pPr>
+              <w:spacing w:after="0" w:line="240"/>
+            </w:pPr>
+            <w:r>
+              <w:rPr>
+                <w:rFonts w:ascii="Consolas" w:cs="Consolas" w:eastAsia="Consolas" w:hAnsi="Consolas"/>
+                <w:color w:val="24303F"/>
+                <w:sz w:val="15"/>
+                <w:szCs w:val="15"/>
+              </w:rPr>
+              <w:t xml:space="preserve">          "@type": "EntryPoint",</w:t>
+            </w:r>
+          </w:p>
+          <w:p>
+            <w:pPr>
+              <w:spacing w:after="0" w:line="240"/>
+            </w:pPr>
+            <w:r>
+              <w:rPr>
+                <w:rFonts w:ascii="Consolas" w:cs="Consolas" w:eastAsia="Consolas" w:hAnsi="Consolas"/>
+                <w:color w:val="24303F"/>
+                <w:sz w:val="15"/>
+                <w:szCs w:val="15"/>
+              </w:rPr>
+              <w:t xml:space="preserve">          "urlTemplate": "https://trillet.ai/search?q={search_term_string}"</w:t>
+            </w:r>
+          </w:p>
+          <w:p>
+            <w:pPr>
+              <w:spacing w:after="0" w:line="240"/>
+            </w:pPr>
+            <w:r>
+              <w:rPr>
+                <w:rFonts w:ascii="Consolas" w:cs="Consolas" w:eastAsia="Consolas" w:hAnsi="Consolas"/>
+                <w:color w:val="24303F"/>
+                <w:sz w:val="15"/>
+                <w:szCs w:val="15"/>
+              </w:rPr>
+              <w:t xml:space="preserve">        },</w:t>
+            </w:r>
+          </w:p>
+          <w:p>
+            <w:pPr>
+              <w:spacing w:after="0" w:line="240"/>
+            </w:pPr>
+            <w:r>
+              <w:rPr>
+                <w:rFonts w:ascii="Consolas" w:cs="Consolas" w:eastAsia="Consolas" w:hAnsi="Consolas"/>
+                <w:color w:val="24303F"/>
+                <w:sz w:val="15"/>
+                <w:szCs w:val="15"/>
+              </w:rPr>
+              <w:t xml:space="preserve">        "query-input": "required name=search_term_string"</w:t>
+            </w:r>
+          </w:p>
+          <w:p>
+            <w:pPr>
+              <w:spacing w:after="0" w:line="240"/>
+            </w:pPr>
+            <w:r>
+              <w:rPr>
+                <w:rFonts w:ascii="Consolas" w:cs="Consolas" w:eastAsia="Consolas" w:hAnsi="Consolas"/>
+                <w:color w:val="24303F"/>
+                <w:sz w:val="15"/>
+                <w:szCs w:val="15"/>
+              </w:rPr>
+              <w:t xml:space="preserve">      }</w:t>
+            </w:r>
+          </w:p>
+          <w:p>
+            <w:pPr>
+              <w:spacing w:after="0" w:line="240"/>
+            </w:pPr>
+            <w:r>
+              <w:rPr>
+                <w:rFonts w:ascii="Consolas" w:cs="Consolas" w:eastAsia="Consolas" w:hAnsi="Consolas"/>
+                <w:color w:val="24303F"/>
+                <w:sz w:val="15"/>
+                <w:szCs w:val="15"/>
+              </w:rPr>
+              <w:t xml:space="preserve">    },</w:t>
+            </w:r>
+          </w:p>
+          <w:p>
+            <w:pPr>
+              <w:spacing w:after="0" w:line="240"/>
+            </w:pPr>
+            <w:r>
+              <w:rPr>
+                <w:rFonts w:ascii="Consolas" w:cs="Consolas" w:eastAsia="Consolas" w:hAnsi="Consolas"/>
+                <w:color w:val="24303F"/>
+                <w:sz w:val="15"/>
+                <w:szCs w:val="15"/>
+              </w:rPr>
+              <w:t xml:space="preserve">    {</w:t>
+            </w:r>
+          </w:p>
+          <w:p>
+            <w:pPr>
+              <w:spacing w:after="0" w:line="240"/>
+            </w:pPr>
+            <w:r>
+              <w:rPr>
+                <w:rFonts w:ascii="Consolas" w:cs="Consolas" w:eastAsia="Consolas" w:hAnsi="Consolas"/>
+                <w:color w:val="24303F"/>
+                <w:sz w:val="15"/>
+                <w:szCs w:val="15"/>
+              </w:rPr>
+              <w:t xml:space="preserve">      "@type": "SoftwareApplication",</w:t>
+            </w:r>
+          </w:p>
+          <w:p>
+            <w:pPr>
+              <w:spacing w:after="0" w:line="240"/>
+            </w:pPr>
+            <w:r>
+              <w:rPr>
+                <w:rFonts w:ascii="Consolas" w:cs="Consolas" w:eastAsia="Consolas" w:hAnsi="Consolas"/>
+                <w:color w:val="24303F"/>
+                <w:sz w:val="15"/>
+                <w:szCs w:val="15"/>
+              </w:rPr>
+              <w:t xml:space="preserve">      "@id": "https://trillet.ai/#software",</w:t>
+            </w:r>
+          </w:p>
+          <w:p>
+            <w:pPr>
+              <w:spacing w:after="0" w:line="240"/>
+            </w:pPr>
+            <w:r>
+              <w:rPr>
+                <w:rFonts w:ascii="Consolas" w:cs="Consolas" w:eastAsia="Consolas" w:hAnsi="Consolas"/>
+                <w:color w:val="24303F"/>
+                <w:sz w:val="15"/>
+                <w:szCs w:val="15"/>
+              </w:rPr>
+              <w:t xml:space="preserve">      "name": "Trillet",</w:t>
+            </w:r>
+          </w:p>
+          <w:p>
+            <w:pPr>
+              <w:spacing w:after="0" w:line="240"/>
+            </w:pPr>
+            <w:r>
+              <w:rPr>
+                <w:rFonts w:ascii="Consolas" w:cs="Consolas" w:eastAsia="Consolas" w:hAnsi="Consolas"/>
+                <w:color w:val="24303F"/>
+                <w:sz w:val="15"/>
+                <w:szCs w:val="15"/>
+              </w:rPr>
+              <w:t xml:space="preserve">      "applicationCategory": "BusinessApplication",</w:t>
+            </w:r>
+          </w:p>
+          <w:p>
+            <w:pPr>
+              <w:spacing w:after="0" w:line="240"/>
+            </w:pPr>
+            <w:r>
+              <w:rPr>
+                <w:rFonts w:ascii="Consolas" w:cs="Consolas" w:eastAsia="Consolas" w:hAnsi="Consolas"/>
+                <w:color w:val="24303F"/>
+                <w:sz w:val="15"/>
+                <w:szCs w:val="15"/>
+              </w:rPr>
+              <w:t xml:space="preserve">      "operatingSystem": "Web",</w:t>
+            </w:r>
+          </w:p>
+          <w:p>
+            <w:pPr>
+              <w:spacing w:after="0" w:line="240"/>
+            </w:pPr>
+            <w:r>
+              <w:rPr>
+                <w:rFonts w:ascii="Consolas" w:cs="Consolas" w:eastAsia="Consolas" w:hAnsi="Consolas"/>
+                <w:color w:val="24303F"/>
+                <w:sz w:val="15"/>
+                <w:szCs w:val="15"/>
+              </w:rPr>
+              <w:t xml:space="preserve">      "url": "https://trillet.ai/",</w:t>
+            </w:r>
+          </w:p>
+          <w:p>
+            <w:pPr>
+              <w:spacing w:after="0" w:line="240"/>
+            </w:pPr>
+            <w:r>
+              <w:rPr>
+                <w:rFonts w:ascii="Consolas" w:cs="Consolas" w:eastAsia="Consolas" w:hAnsi="Consolas"/>
+                <w:color w:val="24303F"/>
+                <w:sz w:val="15"/>
+                <w:szCs w:val="15"/>
+              </w:rPr>
+              <w:t xml:space="preserve">      "description": "Voice AI agents for high-stakes conversations. Verify identity, take action in your live systems, and keep every call on the audit trail. Across voice, SMS and chat.",</w:t>
+            </w:r>
+          </w:p>
+          <w:p>
+            <w:pPr>
+              <w:spacing w:after="0" w:line="240"/>
+            </w:pPr>
+            <w:r>
+              <w:rPr>
+                <w:rFonts w:ascii="Consolas" w:cs="Consolas" w:eastAsia="Consolas" w:hAnsi="Consolas"/>
+                <w:color w:val="24303F"/>
+                <w:sz w:val="15"/>
+                <w:szCs w:val="15"/>
+              </w:rPr>
+              <w:t xml:space="preserve">      "publisher": { "@id": "https://trillet.ai/#organization" },</w:t>
+            </w:r>
+          </w:p>
+          <w:p>
+            <w:pPr>
+              <w:spacing w:after="0" w:line="240"/>
+            </w:pPr>
+            <w:r>
+              <w:rPr>
+                <w:rFonts w:ascii="Consolas" w:cs="Consolas" w:eastAsia="Consolas" w:hAnsi="Consolas"/>
+                <w:color w:val="24303F"/>
+                <w:sz w:val="15"/>
+                <w:szCs w:val="15"/>
+              </w:rPr>
+              <w:t xml:space="preserve">      "offers": {</w:t>
+            </w:r>
+          </w:p>
+          <w:p>
+            <w:pPr>
+              <w:spacing w:after="0" w:line="240"/>
+            </w:pPr>
+            <w:r>
+              <w:rPr>
+                <w:rFonts w:ascii="Consolas" w:cs="Consolas" w:eastAsia="Consolas" w:hAnsi="Consolas"/>
+                <w:color w:val="24303F"/>
+                <w:sz w:val="15"/>
+                <w:szCs w:val="15"/>
+              </w:rPr>
+              <w:t xml:space="preserve">        "@type": "Offer",</w:t>
+            </w:r>
+          </w:p>
+          <w:p>
+            <w:pPr>
+              <w:spacing w:after="0" w:line="240"/>
+            </w:pPr>
+            <w:r>
+              <w:rPr>
+                <w:rFonts w:ascii="Consolas" w:cs="Consolas" w:eastAsia="Consolas" w:hAnsi="Consolas"/>
+                <w:color w:val="24303F"/>
+                <w:sz w:val="15"/>
+                <w:szCs w:val="15"/>
+              </w:rPr>
+              <w:t xml:space="preserve">        "price": "49",</w:t>
+            </w:r>
+          </w:p>
+          <w:p>
+            <w:pPr>
+              <w:spacing w:after="0" w:line="240"/>
+            </w:pPr>
+            <w:r>
+              <w:rPr>
+                <w:rFonts w:ascii="Consolas" w:cs="Consolas" w:eastAsia="Consolas" w:hAnsi="Consolas"/>
+                <w:color w:val="24303F"/>
+                <w:sz w:val="15"/>
+                <w:szCs w:val="15"/>
+              </w:rPr>
+              <w:t xml:space="preserve">        "priceCurrency": "USD",</w:t>
+            </w:r>
+          </w:p>
+          <w:p>
+            <w:pPr>
+              <w:spacing w:after="0" w:line="240"/>
+            </w:pPr>
+            <w:r>
+              <w:rPr>
+                <w:rFonts w:ascii="Consolas" w:cs="Consolas" w:eastAsia="Consolas" w:hAnsi="Consolas"/>
+                <w:color w:val="24303F"/>
+                <w:sz w:val="15"/>
+                <w:szCs w:val="15"/>
+              </w:rPr>
+              <w:t xml:space="preserve">        "description": "Small-business plan, per month"</w:t>
+            </w:r>
+          </w:p>
+          <w:p>
+            <w:pPr>
+              <w:spacing w:after="0" w:line="240"/>
+            </w:pPr>
+            <w:r>
+              <w:rPr>
+                <w:rFonts w:ascii="Consolas" w:cs="Consolas" w:eastAsia="Consolas" w:hAnsi="Consolas"/>
+                <w:color w:val="24303F"/>
+                <w:sz w:val="15"/>
+                <w:szCs w:val="15"/>
+              </w:rPr>
+              <w:t xml:space="preserve">      },</w:t>
+            </w:r>
+          </w:p>
+          <w:p>
+            <w:pPr>
+              <w:spacing w:after="0" w:line="240"/>
+            </w:pPr>
+            <w:r>
+              <w:rPr>
+                <w:rFonts w:ascii="Consolas" w:cs="Consolas" w:eastAsia="Consolas" w:hAnsi="Consolas"/>
+                <w:color w:val="24303F"/>
+                <w:sz w:val="15"/>
+                <w:szCs w:val="15"/>
+              </w:rPr>
+              <w:t xml:space="preserve">      "aggregateRating": {</w:t>
+            </w:r>
+          </w:p>
+          <w:p>
+            <w:pPr>
+              <w:spacing w:after="0" w:line="240"/>
+            </w:pPr>
+            <w:r>
+              <w:rPr>
+                <w:rFonts w:ascii="Consolas" w:cs="Consolas" w:eastAsia="Consolas" w:hAnsi="Consolas"/>
+                <w:color w:val="24303F"/>
+                <w:sz w:val="15"/>
+                <w:szCs w:val="15"/>
+              </w:rPr>
+              <w:t xml:space="preserve">        "@type": "AggregateRating",</w:t>
+            </w:r>
+          </w:p>
+          <w:p>
+            <w:pPr>
+              <w:spacing w:after="0" w:line="240"/>
+            </w:pPr>
+            <w:r>
+              <w:rPr>
+                <w:rFonts w:ascii="Consolas" w:cs="Consolas" w:eastAsia="Consolas" w:hAnsi="Consolas"/>
+                <w:color w:val="24303F"/>
+                <w:sz w:val="15"/>
+                <w:szCs w:val="15"/>
+              </w:rPr>
+              <w:t xml:space="preserve">        "ratingValue": "4.6",</w:t>
+            </w:r>
+          </w:p>
+          <w:p>
+            <w:pPr>
+              <w:spacing w:after="0" w:line="240"/>
+            </w:pPr>
+            <w:r>
+              <w:rPr>
+                <w:rFonts w:ascii="Consolas" w:cs="Consolas" w:eastAsia="Consolas" w:hAnsi="Consolas"/>
+                <w:color w:val="24303F"/>
+                <w:sz w:val="15"/>
+                <w:szCs w:val="15"/>
+              </w:rPr>
+              <w:t xml:space="preserve">        "reviewCount": "REPLACE_TRUSTPILOT_REVIEW_COUNT",</w:t>
+            </w:r>
+          </w:p>
+          <w:p>
+            <w:pPr>
+              <w:spacing w:after="0" w:line="240"/>
+            </w:pPr>
+            <w:r>
+              <w:rPr>
+                <w:rFonts w:ascii="Consolas" w:cs="Consolas" w:eastAsia="Consolas" w:hAnsi="Consolas"/>
+                <w:color w:val="24303F"/>
+                <w:sz w:val="15"/>
+                <w:szCs w:val="15"/>
+              </w:rPr>
+              <w:t xml:space="preserve">        "bestRating": "5"</w:t>
+            </w:r>
+          </w:p>
+          <w:p>
+            <w:pPr>
+              <w:spacing w:after="0" w:line="240"/>
+            </w:pPr>
+            <w:r>
+              <w:rPr>
+                <w:rFonts w:ascii="Consolas" w:cs="Consolas" w:eastAsia="Consolas" w:hAnsi="Consolas"/>
+                <w:color w:val="24303F"/>
+                <w:sz w:val="15"/>
+                <w:szCs w:val="15"/>
+              </w:rPr>
+              <w:t xml:space="preserve">      }</w:t>
+            </w:r>
+          </w:p>
+          <w:p>
+            <w:pPr>
+              <w:spacing w:after="0" w:line="240"/>
+            </w:pPr>
+            <w:r>
+              <w:rPr>
+                <w:rFonts w:ascii="Consolas" w:cs="Consolas" w:eastAsia="Consolas" w:hAnsi="Consolas"/>
+                <w:color w:val="24303F"/>
+                <w:sz w:val="15"/>
+                <w:szCs w:val="15"/>
+              </w:rPr>
+              <w:t xml:space="preserve">    }</w:t>
+            </w:r>
+          </w:p>
+          <w:p>
+            <w:pPr>
+              <w:spacing w:after="0" w:line="240"/>
+            </w:pPr>
+            <w:r>
+              <w:rPr>
+                <w:rFonts w:ascii="Consolas" w:cs="Consolas" w:eastAsia="Consolas" w:hAnsi="Consolas"/>
+                <w:color w:val="24303F"/>
+                <w:sz w:val="15"/>
+                <w:szCs w:val="15"/>
+              </w:rPr>
+              <w:t xml:space="preserve">  ]</w:t>
+            </w:r>
+          </w:p>
+          <w:p>
+            <w:pPr>
+              <w:spacing w:after="0" w:line="240"/>
+            </w:pPr>
+            <w:r>
+              <w:rPr>
+                <w:rFonts w:ascii="Consolas" w:cs="Consolas" w:eastAsia="Consolas" w:hAnsi="Consolas"/>
+                <w:color w:val="24303F"/>
+                <w:sz w:val="15"/>
+                <w:szCs w:val="15"/>
+              </w:rPr>
+              <w:t xml:space="preserve">}</w:t>
+            </w:r>
+          </w:p>
+          <w:p>
+            <w:pPr>
+              <w:spacing w:after="0" w:line="240"/>
+            </w:pPr>
+            <w:r>
+              <w:rPr>
+                <w:rFonts w:ascii="Consolas" w:cs="Consolas" w:eastAsia="Consolas" w:hAnsi="Consolas"/>
+                <w:color w:val="24303F"/>
+                <w:sz w:val="15"/>
+                <w:szCs w:val="15"/>
+              </w:rPr>
+              <w:t xml:space="preserve">&lt;/script&gt;</w:t>
+            </w:r>
+          </w:p>
+        </w:tc>
+      </w:tr>
+    </w:tbl>
+    <w:p>
+      <w:pPr>
+        <w:spacing w:after="120"/>
+      </w:pPr>
+    </w:p>
+    <w:p>
+      <w:pPr>
+        <w:spacing w:after="40" w:before="120"/>
+      </w:pPr>
+      <w:r>
+        <w:rPr>
+          <w:rFonts w:ascii="Consolas" w:cs="Consolas" w:eastAsia="Consolas" w:hAnsi="Consolas"/>
+          <w:b/>
+          <w:bCs/>
+          <w:color w:val="9A6B3F"/>
+          <w:spacing w:val="14"/>
+          <w:sz w:val="15"/>
+          <w:szCs w:val="15"/>
+        </w:rPr>
+        <w:t xml:space="preserve">BLOCK 2 — FAQPAGE</w:t>
+      </w:r>
+    </w:p>
+    <w:tbl>
+      <w:tblPr>
+        <w:tblW w:type="dxa" w:w="9360"/>
+        <w:tblBorders>
+          <w:top w:val="single" w:color="D9DEE8" w:sz="4"/>
+          <w:left w:val="single" w:color="D9DEE8" w:sz="4"/>
+          <w:bottom w:val="single" w:color="D9DEE8" w:sz="4"/>
+          <w:right w:val="single" w:color="D9DEE8" w:sz="4"/>
+          <w:insideH w:val="single" w:color="D9DEE8" w:sz="4"/>
+          <w:insideV w:val="single" w:color="D9DEE8" w:sz="4"/>
+        </w:tblBorders>
+      </w:tblPr>
+      <w:tblGrid>
+        <w:gridCol w:w="9360"/>
+      </w:tblGrid>
+      <w:tr>
+        <w:tc>
+          <w:tcPr>
+            <w:tcW w:type="dxa" w:w="9360"/>
+            <w:shd w:fill="F3F5F8" w:color="auto" w:val="clear"/>
+            <w:tcMar>
+              <w:top w:type="dxa" w:w="120"/>
+              <w:left w:type="dxa" w:w="150"/>
+              <w:bottom w:type="dxa" w:w="120"/>
+              <w:right w:type="dxa" w:w="150"/>
+            </w:tcMar>
+          </w:tcPr>
+          <w:p>
+            <w:pPr>
+              <w:spacing w:after="0" w:line="240"/>
+            </w:pPr>
+            <w:r>
+              <w:rPr>
+                <w:rFonts w:ascii="Consolas" w:cs="Consolas" w:eastAsia="Consolas" w:hAnsi="Consolas"/>
+                <w:color w:val="24303F"/>
+                <w:sz w:val="15"/>
+                <w:szCs w:val="15"/>
+              </w:rPr>
+              <w:t xml:space="preserve">&lt;script type="application/ld+json"&gt;</w:t>
+            </w:r>
+          </w:p>
+          <w:p>
+            <w:pPr>
+              <w:spacing w:after="0" w:line="240"/>
+            </w:pPr>
+            <w:r>
+              <w:rPr>
+                <w:rFonts w:ascii="Consolas" w:cs="Consolas" w:eastAsia="Consolas" w:hAnsi="Consolas"/>
+                <w:color w:val="24303F"/>
+                <w:sz w:val="15"/>
+                <w:szCs w:val="15"/>
+              </w:rPr>
+              <w:t xml:space="preserve">{</w:t>
+            </w:r>
+          </w:p>
+          <w:p>
+            <w:pPr>
+              <w:spacing w:after="0" w:line="240"/>
+            </w:pPr>
+            <w:r>
+              <w:rPr>
+                <w:rFonts w:ascii="Consolas" w:cs="Consolas" w:eastAsia="Consolas" w:hAnsi="Consolas"/>
+                <w:color w:val="24303F"/>
+                <w:sz w:val="15"/>
+                <w:szCs w:val="15"/>
+              </w:rPr>
+              <w:t xml:space="preserve">  "@context": "https://schema.org",</w:t>
+            </w:r>
+          </w:p>
+          <w:p>
+            <w:pPr>
+              <w:spacing w:after="0" w:line="240"/>
+            </w:pPr>
+            <w:r>
+              <w:rPr>
+                <w:rFonts w:ascii="Consolas" w:cs="Consolas" w:eastAsia="Consolas" w:hAnsi="Consolas"/>
+                <w:color w:val="24303F"/>
+                <w:sz w:val="15"/>
+                <w:szCs w:val="15"/>
+              </w:rPr>
+              <w:t xml:space="preserve">  "@type": "FAQPage",</w:t>
+            </w:r>
+          </w:p>
+          <w:p>
+            <w:pPr>
+              <w:spacing w:after="0" w:line="240"/>
+            </w:pPr>
+            <w:r>
+              <w:rPr>
+                <w:rFonts w:ascii="Consolas" w:cs="Consolas" w:eastAsia="Consolas" w:hAnsi="Consolas"/>
+                <w:color w:val="24303F"/>
+                <w:sz w:val="15"/>
+                <w:szCs w:val="15"/>
+              </w:rPr>
+              <w:t xml:space="preserve">  "mainEntity": [</w:t>
+            </w:r>
+          </w:p>
+          <w:p>
+            <w:pPr>
+              <w:spacing w:after="0" w:line="240"/>
+            </w:pPr>
+            <w:r>
+              <w:rPr>
+                <w:rFonts w:ascii="Consolas" w:cs="Consolas" w:eastAsia="Consolas" w:hAnsi="Consolas"/>
+                <w:color w:val="24303F"/>
+                <w:sz w:val="15"/>
+                <w:szCs w:val="15"/>
+              </w:rPr>
+              <w:t xml:space="preserve">    { "@type": "Question", "name": "What is an AI voice agent?",</w:t>
+            </w:r>
+          </w:p>
+          <w:p>
+            <w:pPr>
+              <w:spacing w:after="0" w:line="240"/>
+            </w:pPr>
+            <w:r>
+              <w:rPr>
+                <w:rFonts w:ascii="Consolas" w:cs="Consolas" w:eastAsia="Consolas" w:hAnsi="Consolas"/>
+                <w:color w:val="24303F"/>
+                <w:sz w:val="15"/>
+                <w:szCs w:val="15"/>
+              </w:rPr>
+              <w:t xml:space="preserve">      "acceptedAnswer": { "@type": "Answer", "text": "A voice AI agent answers the phone, understands what the caller needs, and takes action. It books, verifies and resolves calls without menus or scripts." } },</w:t>
+            </w:r>
+          </w:p>
+          <w:p>
+            <w:pPr>
+              <w:spacing w:after="0" w:line="240"/>
+            </w:pPr>
+            <w:r>
+              <w:rPr>
+                <w:rFonts w:ascii="Consolas" w:cs="Consolas" w:eastAsia="Consolas" w:hAnsi="Consolas"/>
+                <w:color w:val="24303F"/>
+                <w:sz w:val="15"/>
+                <w:szCs w:val="15"/>
+              </w:rPr>
+              <w:t xml:space="preserve">    { "@type": "Question", "name": "How do AI voice agents work?",</w:t>
+            </w:r>
+          </w:p>
+          <w:p>
+            <w:pPr>
+              <w:spacing w:after="0" w:line="240"/>
+            </w:pPr>
+            <w:r>
+              <w:rPr>
+                <w:rFonts w:ascii="Consolas" w:cs="Consolas" w:eastAsia="Consolas" w:hAnsi="Consolas"/>
+                <w:color w:val="24303F"/>
+                <w:sz w:val="15"/>
+                <w:szCs w:val="15"/>
+              </w:rPr>
+              <w:t xml:space="preserve">      "acceptedAnswer": { "@type": "Answer", "text": "They combine speech recognition, a language model and text-to-speech to understand and reply in real time, and connect to your systems to complete tasks on the call." } },</w:t>
+            </w:r>
+          </w:p>
+          <w:p>
+            <w:pPr>
+              <w:spacing w:after="0" w:line="240"/>
+            </w:pPr>
+            <w:r>
+              <w:rPr>
+                <w:rFonts w:ascii="Consolas" w:cs="Consolas" w:eastAsia="Consolas" w:hAnsi="Consolas"/>
+                <w:color w:val="24303F"/>
+                <w:sz w:val="15"/>
+                <w:szCs w:val="15"/>
+              </w:rPr>
+              <w:t xml:space="preserve">    { "@type": "Question", "name": "How are they different from a traditional IVR?",</w:t>
+            </w:r>
+          </w:p>
+          <w:p>
+            <w:pPr>
+              <w:spacing w:after="0" w:line="240"/>
+            </w:pPr>
+            <w:r>
+              <w:rPr>
+                <w:rFonts w:ascii="Consolas" w:cs="Consolas" w:eastAsia="Consolas" w:hAnsi="Consolas"/>
+                <w:color w:val="24303F"/>
+                <w:sz w:val="15"/>
+                <w:szCs w:val="15"/>
+              </w:rPr>
+              <w:t xml:space="preserve">      "acceptedAnswer": { "@type": "Answer", "text": "An IVR routes you through a menu. A voice AI agent listens, answers follow-up questions, and completes the request itself." } },</w:t>
+            </w:r>
+          </w:p>
+          <w:p>
+            <w:pPr>
+              <w:spacing w:after="0" w:line="240"/>
+            </w:pPr>
+            <w:r>
+              <w:rPr>
+                <w:rFonts w:ascii="Consolas" w:cs="Consolas" w:eastAsia="Consolas" w:hAnsi="Consolas"/>
+                <w:color w:val="24303F"/>
+                <w:sz w:val="15"/>
+                <w:szCs w:val="15"/>
+              </w:rPr>
+              <w:t xml:space="preserve">    { "@type": "Question", "name": "Is Trillet HIPAA and SOC 2 compliant?",</w:t>
+            </w:r>
+          </w:p>
+          <w:p>
+            <w:pPr>
+              <w:spacing w:after="0" w:line="240"/>
+            </w:pPr>
+            <w:r>
+              <w:rPr>
+                <w:rFonts w:ascii="Consolas" w:cs="Consolas" w:eastAsia="Consolas" w:hAnsi="Consolas"/>
+                <w:color w:val="24303F"/>
+                <w:sz w:val="15"/>
+                <w:szCs w:val="15"/>
+              </w:rPr>
+              <w:t xml:space="preserve">      "acceptedAnswer": { "@type": "Answer", "text": "Yes. HIPAA, SOC 2 Type II, ISO 27001, GDPR, TCPA and ACMA, on every plan, not only enterprise." } },</w:t>
+            </w:r>
+          </w:p>
+          <w:p>
+            <w:pPr>
+              <w:spacing w:after="0" w:line="240"/>
+            </w:pPr>
+            <w:r>
+              <w:rPr>
+                <w:rFonts w:ascii="Consolas" w:cs="Consolas" w:eastAsia="Consolas" w:hAnsi="Consolas"/>
+                <w:color w:val="24303F"/>
+                <w:sz w:val="15"/>
+                <w:szCs w:val="15"/>
+              </w:rPr>
+              <w:t xml:space="preserve">    { "@type": "Question", "name": "Can Trillet book appointments and take payments?",</w:t>
+            </w:r>
+          </w:p>
+          <w:p>
+            <w:pPr>
+              <w:spacing w:after="0" w:line="240"/>
+            </w:pPr>
+            <w:r>
+              <w:rPr>
+                <w:rFonts w:ascii="Consolas" w:cs="Consolas" w:eastAsia="Consolas" w:hAnsi="Consolas"/>
+                <w:color w:val="24303F"/>
+                <w:sz w:val="15"/>
+                <w:szCs w:val="15"/>
+              </w:rPr>
+              <w:t xml:space="preserve">      "acceptedAnswer": { "@type": "Answer", "text": "Yes. Agents book and reschedule appointments and set up payments and payment plans in your live systems during the call." } },</w:t>
+            </w:r>
+          </w:p>
+          <w:p>
+            <w:pPr>
+              <w:spacing w:after="0" w:line="240"/>
+            </w:pPr>
+            <w:r>
+              <w:rPr>
+                <w:rFonts w:ascii="Consolas" w:cs="Consolas" w:eastAsia="Consolas" w:hAnsi="Consolas"/>
+                <w:color w:val="24303F"/>
+                <w:sz w:val="15"/>
+                <w:szCs w:val="15"/>
+              </w:rPr>
+              <w:t xml:space="preserve">    { "@type": "Question", "name": "Does it integrate with my CRM?",</w:t>
+            </w:r>
+          </w:p>
+          <w:p>
+            <w:pPr>
+              <w:spacing w:after="0" w:line="240"/>
+            </w:pPr>
+            <w:r>
+              <w:rPr>
+                <w:rFonts w:ascii="Consolas" w:cs="Consolas" w:eastAsia="Consolas" w:hAnsi="Consolas"/>
+                <w:color w:val="24303F"/>
+                <w:sz w:val="15"/>
+                <w:szCs w:val="15"/>
+              </w:rPr>
+              <w:t xml:space="preserve">      "acceptedAnswer": { "@type": "Answer", "text": "Trillet connects to your telephony, CRM, practice-management, payment and calendar tools, and reads and writes in real time." } },</w:t>
+            </w:r>
+          </w:p>
+          <w:p>
+            <w:pPr>
+              <w:spacing w:after="0" w:line="240"/>
+            </w:pPr>
+            <w:r>
+              <w:rPr>
+                <w:rFonts w:ascii="Consolas" w:cs="Consolas" w:eastAsia="Consolas" w:hAnsi="Consolas"/>
+                <w:color w:val="24303F"/>
+                <w:sz w:val="15"/>
+                <w:szCs w:val="15"/>
+              </w:rPr>
+              <w:t xml:space="preserve">    { "@type": "Question", "name": "Can I keep my existing phone number?",</w:t>
+            </w:r>
+          </w:p>
+          <w:p>
+            <w:pPr>
+              <w:spacing w:after="0" w:line="240"/>
+            </w:pPr>
+            <w:r>
+              <w:rPr>
+                <w:rFonts w:ascii="Consolas" w:cs="Consolas" w:eastAsia="Consolas" w:hAnsi="Consolas"/>
+                <w:color w:val="24303F"/>
+                <w:sz w:val="15"/>
+                <w:szCs w:val="15"/>
+              </w:rPr>
+              <w:t xml:space="preserve">      "acceptedAnswer": { "@type": "Answer", "text": "Yes. Trillet forwards your calls with no number porting, so you keep your existing number." } },</w:t>
+            </w:r>
+          </w:p>
+          <w:p>
+            <w:pPr>
+              <w:spacing w:after="0" w:line="240"/>
+            </w:pPr>
+            <w:r>
+              <w:rPr>
+                <w:rFonts w:ascii="Consolas" w:cs="Consolas" w:eastAsia="Consolas" w:hAnsi="Consolas"/>
+                <w:color w:val="24303F"/>
+                <w:sz w:val="15"/>
+                <w:szCs w:val="15"/>
+              </w:rPr>
+              <w:t xml:space="preserve">    { "@type": "Question", "name": "How fast can I go live?",</w:t>
+            </w:r>
+          </w:p>
+          <w:p>
+            <w:pPr>
+              <w:spacing w:after="0" w:line="240"/>
+            </w:pPr>
+            <w:r>
+              <w:rPr>
+                <w:rFonts w:ascii="Consolas" w:cs="Consolas" w:eastAsia="Consolas" w:hAnsi="Consolas"/>
+                <w:color w:val="24303F"/>
+                <w:sz w:val="15"/>
+                <w:szCs w:val="15"/>
+              </w:rPr>
+              <w:t xml:space="preserve">      "acceptedAnswer": { "@type": "Answer", "text": "Build an agent by scanning your website and go live in minutes. Small-business plans start from 49 USD per month." } },</w:t>
+            </w:r>
+          </w:p>
+          <w:p>
+            <w:pPr>
+              <w:spacing w:after="0" w:line="240"/>
+            </w:pPr>
+            <w:r>
+              <w:rPr>
+                <w:rFonts w:ascii="Consolas" w:cs="Consolas" w:eastAsia="Consolas" w:hAnsi="Consolas"/>
+                <w:color w:val="24303F"/>
+                <w:sz w:val="15"/>
+                <w:szCs w:val="15"/>
+              </w:rPr>
+              <w:t xml:space="preserve">    { "@type": "Question", "name": "Can I white-label and resell Trillet?",</w:t>
+            </w:r>
+          </w:p>
+          <w:p>
+            <w:pPr>
+              <w:spacing w:after="0" w:line="240"/>
+            </w:pPr>
+            <w:r>
+              <w:rPr>
+                <w:rFonts w:ascii="Consolas" w:cs="Consolas" w:eastAsia="Consolas" w:hAnsi="Consolas"/>
+                <w:color w:val="24303F"/>
+                <w:sz w:val="15"/>
+                <w:szCs w:val="15"/>
+              </w:rPr>
+              <w:t xml:space="preserve">      "acceptedAnswer": { "@type": "Answer", "text": "Yes. Agencies run Trillet under their own brand in isolated workspaces, and keep the margin." } },</w:t>
+            </w:r>
+          </w:p>
+          <w:p>
+            <w:pPr>
+              <w:spacing w:after="0" w:line="240"/>
+            </w:pPr>
+            <w:r>
+              <w:rPr>
+                <w:rFonts w:ascii="Consolas" w:cs="Consolas" w:eastAsia="Consolas" w:hAnsi="Consolas"/>
+                <w:color w:val="24303F"/>
+                <w:sz w:val="15"/>
+                <w:szCs w:val="15"/>
+              </w:rPr>
+              <w:t xml:space="preserve">    { "@type": "Question", "name": "Where is my data stored?",</w:t>
+            </w:r>
+          </w:p>
+          <w:p>
+            <w:pPr>
+              <w:spacing w:after="0" w:line="240"/>
+            </w:pPr>
+            <w:r>
+              <w:rPr>
+                <w:rFonts w:ascii="Consolas" w:cs="Consolas" w:eastAsia="Consolas" w:hAnsi="Consolas"/>
+                <w:color w:val="24303F"/>
+                <w:sz w:val="15"/>
+                <w:szCs w:val="15"/>
+              </w:rPr>
+              <w:t xml:space="preserve">      "acceptedAnswer": { "@type": "Answer", "text": "Recordings, transcripts and backups can be held in Australia, with in-country LLM hosting and on-premise or private-cloud deployment available." } }</w:t>
+            </w:r>
+          </w:p>
+          <w:p>
+            <w:pPr>
+              <w:spacing w:after="0" w:line="240"/>
+            </w:pPr>
+            <w:r>
+              <w:rPr>
+                <w:rFonts w:ascii="Consolas" w:cs="Consolas" w:eastAsia="Consolas" w:hAnsi="Consolas"/>
+                <w:color w:val="24303F"/>
+                <w:sz w:val="15"/>
+                <w:szCs w:val="15"/>
+              </w:rPr>
+              <w:t xml:space="preserve">  ]</w:t>
+            </w:r>
+          </w:p>
+          <w:p>
+            <w:pPr>
+              <w:spacing w:after="0" w:line="240"/>
+            </w:pPr>
+            <w:r>
+              <w:rPr>
+                <w:rFonts w:ascii="Consolas" w:cs="Consolas" w:eastAsia="Consolas" w:hAnsi="Consolas"/>
+                <w:color w:val="24303F"/>
+                <w:sz w:val="15"/>
+                <w:szCs w:val="15"/>
+              </w:rPr>
+              <w:t xml:space="preserve">}</w:t>
+            </w:r>
+          </w:p>
+          <w:p>
+            <w:pPr>
+              <w:spacing w:after="0" w:line="240"/>
+            </w:pPr>
+            <w:r>
+              <w:rPr>
+                <w:rFonts w:ascii="Consolas" w:cs="Consolas" w:eastAsia="Consolas" w:hAnsi="Consolas"/>
+                <w:color w:val="24303F"/>
+                <w:sz w:val="15"/>
+                <w:szCs w:val="15"/>
+              </w:rPr>
+              <w:t xml:space="preserve">&lt;/script&gt;</w:t>
+            </w:r>
+          </w:p>
+        </w:tc>
+      </w:tr>
+    </w:tbl>
+    <w:p>
+      <w:pPr>
+        <w:spacing w:before="100"/>
+      </w:pPr>
+      <w:r>
+        <w:rPr>
+          <w:rFonts w:ascii="Calibri" w:cs="Calibri" w:eastAsia="Calibri" w:hAnsi="Calibri"/>
+          <w:i/>
+          <w:iCs/>
+          <w:color w:val="5A6675"/>
+          <w:sz w:val="17"/>
+          <w:szCs w:val="17"/>
+        </w:rPr>
+        <w:t xml:space="preserve">Note: FAQ rich results are limited to gov/health sites since 2023 — keep the markup for AI answer engines and Bing, but don’t expect an FAQ accordion in Google. Rating/price markup must match the visible page and use a real Trustpilot review count.</w:t>
       </w:r>
     </w:p>
     <w:sectPr>

</xml_diff>